<commit_message>
Add GitHub repo link to Data Availability section
</commit_message>
<xml_diff>
--- a/Manuscript/Manuscript.docx
+++ b/Manuscript/Manuscript.docx
@@ -5920,7 +5920,7 @@
         <w:pStyle w:val="FirstParagraph"/>
       </w:pPr>
       <w:r>
-        <w:t xml:space="preserve">Analysis code is available in</w:t>
+        <w:t xml:space="preserve">All analysis code, results, and publication figures are available at https://github.com/rstil2/reference-genome-sex-bias. Primary variant-level results are in</w:t>
       </w:r>
       <w:r>
         <w:t xml:space="preserve"> </w:t>
@@ -5929,10 +5929,10 @@
         <w:rPr>
           <w:rStyle w:val="VerbatimChar"/>
         </w:rPr>
-        <w:t xml:space="preserve">Study_v2_Real_Data/Code/</w:t>
-      </w:r>
-      <w:r>
-        <w:t xml:space="preserve">. Primary variant-level results are in</w:t>
+        <w:t xml:space="preserve">Results/variant_analysis/</w:t>
+      </w:r>
+      <w:r>
+        <w:t xml:space="preserve">. Delta-delta summaries with Holm–Bonferroni correction for all five classifiers are in</w:t>
       </w:r>
       <w:r>
         <w:t xml:space="preserve"> </w:t>
@@ -5941,10 +5941,10 @@
         <w:rPr>
           <w:rStyle w:val="VerbatimChar"/>
         </w:rPr>
-        <w:t xml:space="preserve">Study_v2_Real_Data/Results/variant_analysis/</w:t>
-      </w:r>
-      <w:r>
-        <w:t xml:space="preserve">. Delta-delta summaries with Holm–Bonferroni correction for all five classifiers are in</w:t>
+        <w:t xml:space="preserve">Results/metrics/final/all_models_holm_corrected.json</w:t>
+      </w:r>
+      <w:r>
+        <w:t xml:space="preserve">. Robustness battery outputs are in</w:t>
       </w:r>
       <w:r>
         <w:t xml:space="preserve"> </w:t>
@@ -5953,10 +5953,10 @@
         <w:rPr>
           <w:rStyle w:val="VerbatimChar"/>
         </w:rPr>
-        <w:t xml:space="preserve">Study_v2_Real_Data/Results/metrics/final/all_models_holm_corrected.json</w:t>
-      </w:r>
-      <w:r>
-        <w:t xml:space="preserve">. Robustness battery outputs are in</w:t>
+        <w:t xml:space="preserve">Results/robustness/</w:t>
+      </w:r>
+      <w:r>
+        <w:t xml:space="preserve">. Publication-quality figures are in</w:t>
       </w:r>
       <w:r>
         <w:t xml:space="preserve"> </w:t>
@@ -5965,10 +5965,10 @@
         <w:rPr>
           <w:rStyle w:val="VerbatimChar"/>
         </w:rPr>
-        <w:t xml:space="preserve">Study_v2_Real_Data/Results/robustness/</w:t>
-      </w:r>
-      <w:r>
-        <w:t xml:space="preserve">. Publication-quality figures are in</w:t>
+        <w:t xml:space="preserve">Figures/</w:t>
+      </w:r>
+      <w:r>
+        <w:t xml:space="preserve">. A complete environment snapshot is archived in</w:t>
       </w:r>
       <w:r>
         <w:t xml:space="preserve"> </w:t>
@@ -5977,22 +5977,10 @@
         <w:rPr>
           <w:rStyle w:val="VerbatimChar"/>
         </w:rPr>
-        <w:t xml:space="preserve">Study_v2_Real_Data/Figures/</w:t>
-      </w:r>
-      <w:r>
-        <w:t xml:space="preserve">. A complete environment snapshot is archived in</w:t>
-      </w:r>
-      <w:r>
-        <w:t xml:space="preserve"> </w:t>
-      </w:r>
-      <w:r>
-        <w:rPr>
-          <w:rStyle w:val="VerbatimChar"/>
-        </w:rPr>
-        <w:t xml:space="preserve">Study_v2_Real_Data/Results/environment/</w:t>
-      </w:r>
-      <w:r>
-        <w:t xml:space="preserve">.</w:t>
+        <w:t xml:space="preserve">Results/environment/</w:t>
+      </w:r>
+      <w:r>
+        <w:t xml:space="preserve">. Raw VCF data are publicly available from the 1000 Genomes Project (GRCh38: NYGC high-coverage callset; T2T-CHM13v2.0: 1000 Genomes on T2T callset).</w:t>
       </w:r>
     </w:p>
     <w:p>

</xml_diff>

<commit_message>
Address AI review critiques: strengthen framing, add methods detail, fix inconsistencies
- Abstract: representation ≠ downstream bias framing; fix 'all five' → 'four of five'; fix typo
- Intro: haploid → hemizygous; strengthen research gap statement
- Methods §2.4.2: add feature selection details (500 SNPs/chr, MAF≥0.01, CR≥0.95, file order)
- Methods §2.4.2: justify superpopulation task choice; document chrX ploidy handling
- Methods §2.4.4: justify 0.01 practical effect-size threshold
- Results §3.4: explain T2T PAR2 absence (no variant records in callset)
- Discussion §4.2: fix superpopulation consistency (four of five)
- Discussion §4.5: strengthen fairness implication; add future directions (GWAS, PRS, XCI)
- Discussion §4.4: soften 'robustness battery' → 'robustness analyses/scope'
- Conclusions: nuance superpopulation wording
</commit_message>
<xml_diff>
--- a/Manuscript/Manuscript.docx
+++ b/Manuscript/Manuscript.docx
@@ -72,7 +72,7 @@
         <w:t xml:space="preserve"> </w:t>
       </w:r>
       <w:r>
-        <w:t xml:space="preserve">Reference genome choice shapes variant discovery, and the X chromosome is uniquely sensitive to assembly completeness: sex-specific ploidy means that assembly improvements unlock heterozygous sites primarily in female samples. Whether such representational differences propagate to downstream machine-learning endpoints has not been tested.</w:t>
+        <w:t xml:space="preserve">Reference genome choice shapes variant discovery, and the X chromosome is uniquely sensitive to assembly completeness: sex-specific ploidy means that assembly improvements reveal heterozygous sites primarily in female samples. However, representational differences in variant discovery need not entail bias in downstream analytical endpoints; whether upstream measurement shifts propagate to machine-learning disparity has not been tested.</w:t>
       </w:r>
     </w:p>
     <w:p>
@@ -153,7 +153,7 @@
         <w:t xml:space="preserve"> </w:t>
       </w:r>
       <w:r>
-        <w:t xml:space="preserve">= 5.23 × 10⁻²⁰⁰), uniform across all five superpopulations. Male chrX heterozygosity remained near zero under both assemblies. Despite this large upstream shift, no classifier showed a significant reference-associated change in sex disparity: all Holm-adjusted</w:t>
+        <w:t xml:space="preserve">= 5.23 × 10⁻²⁰⁰), present in four of five superpopulations. Male chrX heterozygosity remained near zero under both assemblies. Despite this large upstream shift, no classifier showed a significant reference-associated change in sex disparity: all Holm-adjusted</w:t>
       </w:r>
       <w:r>
         <w:t xml:space="preserve"> </w:t>
@@ -190,7 +190,7 @@
         <w:t xml:space="preserve"> </w:t>
       </w:r>
       <w:r>
-        <w:t xml:space="preserve">across models was −0.0007’s. The pre-specified confirmatory framework classified the evidence as Tier C (exploratory).</w:t>
+        <w:t xml:space="preserve">across models was −0.0007. The pre-specified confirmatory framework classified the evidence as Tier C (exploratory).</w:t>
       </w:r>
     </w:p>
     <w:p>
@@ -241,7 +241,7 @@
         <w:pStyle w:val="BodyText"/>
       </w:pPr>
       <w:r>
-        <w:t xml:space="preserve">The X chromosome is the most sensitive locus for sex-linked reference effects. ChrX is haploid in males and diploid in females, so assembly improvements that resolve previously inaccessible sequence expose heterozygous positions primarily in female samples. Two pseudoautosomal regions (PAR1 and PAR2)—shared with chrY and behaving as diploid in both sexes—have boundary coordinates that differ between assemblies, creating additional potential for sex-differential variant calling at the transitions. The recent completion of the Y chromosome sequence [13] confirms that sex-chromosome assembly quality has lagged autosomes, amplifying these concerns. These properties make chrX a natural stress test for reference-induced measurement asymmetry.</w:t>
+        <w:t xml:space="preserve">The X chromosome is the most sensitive locus for sex-linked reference effects. ChrX is hemizygous in males and diploid in females, so assembly improvements that resolve previously inaccessible sequence expose heterozygous positions primarily in female samples. Two pseudoautosomal regions (PAR1 and PAR2)—shared with chrY and behaving as diploid in both sexes—have boundary coordinates that differ between assemblies, creating additional potential for sex-differential variant calling at the transitions. The recent completion of the Y chromosome sequence [13] confirms that sex-chromosome assembly quality has lagged autosomes, amplifying these concerns. These properties make chrX a natural stress test for reference-induced measurement asymmetry.</w:t>
       </w:r>
     </w:p>
     <w:p>
@@ -249,7 +249,7 @@
         <w:pStyle w:val="BodyText"/>
       </w:pPr>
       <w:r>
-        <w:t xml:space="preserve">A separate question is whether upstream representational differences propagate to downstream analytical endpoints. Machine-learning classifiers trained on reference-derived variant features could exhibit different sex-disparity profiles if the sex-differential feature distribution shifts between references. This propagation pathway has direct implications for algorithmic fairness assessments in genomic medicine but has not been empirically tested.</w:t>
+        <w:t xml:space="preserve">A separate question is whether upstream representational differences propagate to downstream analytical endpoints. Machine-learning classifiers trained on reference-derived variant features could exhibit different sex-disparity profiles if the sex-differential feature distribution shifts between references. This propagation pathway has direct implications for algorithmic fairness assessments in genomic medicine, yet whether reference-induced measurement asymmetries translate into downstream disparity shifts remains empirically untested.</w:t>
       </w:r>
     </w:p>
     <w:p>
@@ -1028,7 +1028,15 @@
         <w:pStyle w:val="FirstParagraph"/>
       </w:pPr>
       <w:r>
-        <w:t xml:space="preserve">Five classifier families were evaluated: logistic regression, random forest, XGBoost [9], support vector machine (SVM), and multilayer perceptron (MLP) [10]. Each classifier was trained to predict superpopulation membership from genome-wide variant features (approximately 11,500 features: 500 variants per chromosome × 23 chromosomes).</w:t>
+        <w:t xml:space="preserve">Five classifier families were evaluated: logistic regression, random forest, XGBoost [9], support vector machine (SVM), and multilayer perceptron (MLP) [10]. Each classifier was trained to predict superpopulation membership from genome-wide variant features (approximately 11,500 features: 500 variants per chromosome × 23 chromosomes). Superpopulation classification was chosen as the downstream task because it provides a high-signal genomic prediction problem driven largely by autosomal common variation, enabling sensitive detection of reference-induced feature shifts without phenotype confounding.</w:t>
+      </w:r>
+    </w:p>
+    <w:p>
+      <w:pPr>
+        <w:pStyle w:val="BodyText"/>
+      </w:pPr>
+      <w:r>
+        <w:t xml:space="preserve">For each chromosome, the first 500 biallelic SNPs passing minimum quality filters (minor allele frequency ≥ 0.01, call rate ≥ 0.95) were selected in VCF file order. The same filtering thresholds were applied independently to each reference. Genotypes were encoded as diploid dosages (sum of allele values). Male hemizygous chrX calls, represented as single-allele genotypes in the VCF, returned missing values during dosage parsing and were imputed during preprocessing alongside other missing data, consistent with standard practice for mixed-ploidy chromosomes in population-scale analyses.</w:t>
       </w:r>
     </w:p>
     <w:p>
@@ -1284,7 +1292,7 @@
         <w:t xml:space="preserve"> </w:t>
       </w:r>
       <w:r>
-        <w:t xml:space="preserve">for at least one model.</w:t>
+        <w:t xml:space="preserve">for at least one model. This threshold corresponds to a one-percentage-point shift in balanced accuracy, below which group-level disparity differences are unlikely to have practical consequences for downstream applications.</w:t>
       </w:r>
     </w:p>
     <w:p>
@@ -2558,7 +2566,7 @@
         <w:t xml:space="preserve"> </w:t>
       </w:r>
       <w:r>
-        <w:t xml:space="preserve">&lt; 2.2 × 10⁻¹⁶) that could not be assessed under T2T (no variant records recovered). These opposing patterns are consistent with different PAR boundary placements between assemblies producing different diploid/haploid calling behavior across sexes in pseudoautosomal transition zones.</w:t>
+        <w:t xml:space="preserve">&lt; 2.2 × 10⁻¹⁶) that could not be assessed under T2T because the 1KGP T2T callset contains no variant records in the T2T-specific PAR2 coordinate range (chrX:155,701,383–156,030,895), likely because the variant-calling pipeline treated this region differently under the T2T assembly. These opposing patterns are consistent with different PAR boundary placements between assemblies producing different diploid/haploid calling behavior across sexes in pseudoautosomal transition zones.</w:t>
       </w:r>
     </w:p>
     <w:bookmarkEnd w:id="25"/>
@@ -5565,7 +5573,7 @@
         <w:pStyle w:val="BodyText"/>
       </w:pPr>
       <w:r>
-        <w:t xml:space="preserve">Three observations reinforce this assembly-driven interpretation. First, the reduced standard deviation under T2T (0.055 vs. 0.062) indicates that GRCh38’s assembly gaps introduce sample-to-sample noise in which sites happen to be callable, and that a more complete assembly removes this noise. Second, the directional shift is present across all five superpopulations (Table 2), ruling out a population-genetics explanation. Third, the approximately 8.3% female call rate reduction under T2T reflects expanded coordinate space rather than inferior coverage: T2T contains sites absent from GRCh38 that register as uncalled in a per-site denominator. The absence of any analogous sex-differential shift on chromosome 22 confirms chrX-specificity.</w:t>
+        <w:t xml:space="preserve">Three observations reinforce this assembly-driven interpretation. First, the reduced standard deviation under T2T (0.055 vs. 0.062) indicates that GRCh38’s assembly gaps introduce sample-to-sample noise in which sites happen to be callable, and that a more complete assembly removes this noise. Second, the directional shift is present in four of five superpopulations (Table 2); the modest negative delta in AFR reflects an already-high baseline rather than a reversed mechanism, and the overall pattern rules out a simple population-genetics explanation. Third, the approximately 8.3% female call rate reduction under T2T reflects expanded coordinate space rather than inferior coverage: T2T contains sites absent from GRCh38 that register as uncalled in a per-site denominator. The absence of any analogous sex-differential shift on chromosome 22 confirms chrX-specificity.</w:t>
       </w:r>
     </w:p>
     <w:p>
@@ -5641,7 +5649,7 @@
         <w:pStyle w:val="BodyText"/>
       </w:pPr>
       <w:r>
-        <w:t xml:space="preserve">The robustness battery strengthens this null interpretation. Label permutation confirmed that models learn genuine population structure (permuted accuracy ≈ 0.20). Leave-one-superpopulation-out analysis showed expected performance degradation without sex-differential effects. The sex-balance stress test confirmed that minor cohort imbalance does not drive the result.</w:t>
+        <w:t xml:space="preserve">The robustness analyses strengthen this null interpretation. Label permutation confirmed that models learn genuine population structure (permuted accuracy ≈ 0.20). Leave-one-superpopulation-out analysis showed expected performance degradation without sex-differential effects. The sex-balance stress test confirmed that minor cohort imbalance does not drive the result.</w:t>
       </w:r>
     </w:p>
     <w:bookmarkEnd w:id="32"/>
@@ -5760,7 +5768,7 @@
           <w:b/>
           <w:bCs/>
         </w:rPr>
-        <w:t xml:space="preserve">Robustness battery scope.</w:t>
+        <w:t xml:space="preserve">Robustness scope.</w:t>
       </w:r>
       <w:r>
         <w:t xml:space="preserve"> </w:t>
@@ -5812,7 +5820,7 @@
         <w:t xml:space="preserve"> </w:t>
       </w:r>
       <w:r>
-        <w:t xml:space="preserve">Representational audits and downstream disparity audits answer distinct questions. This study demonstrates that the two can diverge completely—a large upstream representational shift need not propagate to a downstream fairness metric. Both audits require explicit empirical evaluation.</w:t>
+        <w:t xml:space="preserve">Representational audits and downstream disparity audits answer distinct questions. This study demonstrates that the two can diverge completely—a large upstream representational shift need not propagate to a downstream fairness metric. Both audits require explicit empirical evaluation. Future fairness frameworks for genomic pipelines should incorporate reference-awareness as a design variable alongside conventional protected attributes.</w:t>
       </w:r>
     </w:p>
     <w:p>
@@ -5830,7 +5838,7 @@
         <w:t xml:space="preserve"> </w:t>
       </w:r>
       <w:r>
-        <w:t xml:space="preserve">The null downstream result is encouraging for the GRCh38-to-T2T transition in classification-based analyses, but should not be generalized without task-specific evaluation.</w:t>
+        <w:t xml:space="preserve">The null downstream result is encouraging for the GRCh38-to-T2T transition in classification-based analyses, but should not be generalized without task-specific evaluation. Tasks that depend directly on chrX variant density—such as GWAS calibration for X-linked loci, polygenic risk score construction incorporating sex chromosomes, or X-inactivation inference—may exhibit sensitivities that ancestry classification does not capture.</w:t>
       </w:r>
     </w:p>
     <w:p>
@@ -5881,7 +5889,7 @@
         <w:t xml:space="preserve"> </w:t>
       </w:r>
       <w:r>
-        <w:t xml:space="preserve">= 5.23 × 10⁻²⁰⁰), an effect consistent across five superpopulations and attributable to improved chrX assembly completeness. Male chrX heterozygosity remains near zero under both assemblies. Despite this large upstream effect, five downstream classifier families show no reference-associated shift in sex disparity (all Holm-adjusted</w:t>
+        <w:t xml:space="preserve">= 5.23 × 10⁻²⁰⁰), an effect observed across all five superpopulations (four of five showing the expected positive direction) and attributable to improved chrX assembly completeness. Male chrX heterozygosity remains near zero under both assemblies. Despite this large upstream effect, five downstream classifier families show no reference-associated shift in sex disparity (all Holm-adjusted</w:t>
       </w:r>
       <w:r>
         <w:t xml:space="preserve"> </w:t>

</xml_diff>